<commit_message>
Add reproducible supplementary submission package
</commit_message>
<xml_diff>
--- a/manuscript/manuscript.docx
+++ b/manuscript/manuscript.docx
@@ -2334,22 +2334,7 @@
         <w:pStyle w:val="BodyText"/>
       </w:pPr>
       <w:r>
-        <w:t xml:space="preserve">GeoFM-LDN (Geospatial Foundation-Model Latent Dynamics Network; the repository’s former</w:t>
-      </w:r>
-      <w:r>
-        <w:t xml:space="preserve"> </w:t>
-      </w:r>
-      <w:r>
-        <w:rPr>
-          <w:rStyle w:val="VerbatimChar"/>
-        </w:rPr>
-        <w:t xml:space="preserve">paper58</w:t>
-      </w:r>
-      <w:r>
-        <w:t xml:space="preserve"> </w:t>
-      </w:r>
-      <w:r>
-        <w:t xml:space="preserve">path identifier) was implemented as a demand-conditioned residual latent-dynamics network on 64-channel AlphaEarth patches. Three 128-channel convolutions use dilation rates 1, 2 and 4, followed by a 1 × 1 projection to a 64-dimensional latent state. A 12-dimensional action vector (origin and target counts for six classes) is encoded by a two-layer MLP and broadcast across the patch before concatenation with the embedding. Group normalization and GELU activations are used in the residual blocks. A scikit-learn logistic-regression decoder maps the predicted latent embedding to six semantic classes. Training uses 64 × 64 patches, batch size 2, eight epochs, AdamW with learning rate</w:t>
+        <w:t xml:space="preserve">GeoFM-LDN (Geospatial Foundation-Model Latent Dynamics Network; the repository’s legacy path identifier) was implemented as a demand-conditioned residual latent-dynamics network on 64-channel AlphaEarth patches. Three 128-channel convolutions use dilation rates 1, 2 and 4, followed by a 1 × 1 projection to a 64-dimensional latent state. A 12-dimensional action vector (origin and target counts for six classes) is encoded by a two-layer MLP and broadcast across the patch before concatenation with the embedding. Group normalization and GELU activations are used in the residual blocks. A scikit-learn logistic-regression decoder maps the predicted latent embedding to six semantic classes. Training uses 64 × 64 patches, batch size 2, eight epochs, AdamW with learning rate</w:t>
       </w:r>
       <w:r>
         <w:t xml:space="preserve"> </w:t>

</xml_diff>

<commit_message>
Cite Zenodo v2.1 archival DOI
</commit_message>
<xml_diff>
--- a/manuscript/manuscript.docx
+++ b/manuscript/manuscript.docx
@@ -6778,7 +6778,7 @@
         <w:t xml:space="preserve"> </w:t>
       </w:r>
       <w:r>
-        <w:t xml:space="preserve">in the accompanying repository. The ArcGIS-served cross-product source release is archived at Zenodo v2.0.0 (https://doi.org/10.5281/zenodo.22689057), corresponding to GitHub tag</w:t>
+        <w:t xml:space="preserve">in the accompanying repository. The ArcGIS-served cross-product source release is archived at Zenodo v2.1.0 (https://doi.org/10.5281/zenodo.22763326), corresponding to GitHub tag</w:t>
       </w:r>
       <w:r>
         <w:t xml:space="preserve"> </w:t>
@@ -6787,7 +6787,7 @@
         <w:rPr>
           <w:rStyle w:val="VerbatimChar"/>
         </w:rPr>
-        <w:t xml:space="preserve">v2.0.0</w:t>
+        <w:t xml:space="preserve">v2.1.0</w:t>
       </w:r>
       <w:r>
         <w:t xml:space="preserve"> </w:t>
@@ -6802,10 +6802,10 @@
         <w:rPr>
           <w:rStyle w:val="VerbatimChar"/>
         </w:rPr>
-        <w:t xml:space="preserve">77e2c59</w:t>
-      </w:r>
-      <w:r>
-        <w:t xml:space="preserve">; the version-independent concept DOI is https://doi.org/10.5281/zenodo.22663475. The published v2 release is defined by</w:t>
+        <w:t xml:space="preserve">efb0961</w:t>
+      </w:r>
+      <w:r>
+        <w:t xml:space="preserve">; the version-independent concept DOI is https://doi.org/10.5281/zenodo.22663475. The published v2.1 release is defined by</w:t>
       </w:r>
       <w:r>
         <w:t xml:space="preserve"> </w:t>
@@ -7219,13 +7219,13 @@
         <w:t xml:space="preserve">core.autocrlf=true</w:t>
       </w:r>
       <w:r>
-        <w:t xml:space="preserve">; exact verification of the published v2.0.0 manifests requires a separate LF checkout (</w:t>
+        <w:t xml:space="preserve">; exact verification of the published v2.1.0 manifests requires a separate LF checkout (</w:t>
       </w:r>
       <w:r>
         <w:rPr>
           <w:rStyle w:val="VerbatimChar"/>
         </w:rPr>
-        <w:t xml:space="preserve">git -c core.autocrlf=false checkout v2.0.0</w:t>
+        <w:t xml:space="preserve">git -c core.autocrlf=false checkout v2.1.0</w:t>
       </w:r>
       <w:r>
         <w:t xml:space="preserve">) because six historic text records use raw-byte hashes. The locked macOS arm64 execution environment remains the reference for model outputs. An archived arm64 Linux rerun of the six historical Kernel rasters differed from the macOS reference by 498–1,147 cells (0.62%–1.44%), with strict-FoM deltas from -0.0023 to +0.0010; these cross-stack differences are quantified rather than treated as categorical identity. A maintained GitHub Actions Ubuntu x86_64 rerun of all six rasters under the resolved lock had zero categorical differences; the repository-stored CI audit is in</w:t>
@@ -7260,7 +7260,7 @@
         <w:pStyle w:val="FirstParagraph"/>
       </w:pPr>
       <w:r>
-        <w:t xml:space="preserve">The current working revision and the published v2.0.0 archive are distinct</w:t>
+        <w:t xml:space="preserve">The current working revision and the published v2.1.0 archive are distinct</w:t>
       </w:r>
       <w:r>
         <w:t xml:space="preserve"> </w:t>
@@ -7709,7 +7709,7 @@
         <w:t xml:space="preserve"> </w:t>
       </w:r>
       <w:r>
-        <w:t xml:space="preserve">https://doi.org/10.5281/zenodo.22689057 and corresponds to GitHub tag</w:t>
+        <w:t xml:space="preserve">https://doi.org/10.5281/zenodo.22763326 and corresponds to GitHub tag</w:t>
       </w:r>
       <w:r>
         <w:t xml:space="preserve"> </w:t>
@@ -7718,7 +7718,7 @@
         <w:rPr>
           <w:rStyle w:val="VerbatimChar"/>
         </w:rPr>
-        <w:t xml:space="preserve">v2.0.0</w:t>
+        <w:t xml:space="preserve">v2.1.0</w:t>
       </w:r>
       <w:r>
         <w:t xml:space="preserve"> </w:t>
@@ -7733,7 +7733,7 @@
         <w:rPr>
           <w:rStyle w:val="VerbatimChar"/>
         </w:rPr>
-        <w:t xml:space="preserve">77e2c59</w:t>
+        <w:t xml:space="preserve">efb0961</w:t>
       </w:r>
       <w:r>
         <w:t xml:space="preserve">; the DOI identifies the public benchmark source release,</w:t>

</xml_diff>